<commit_message>
feat: college_name variable — college name from Settings across form templates
Adds ojt_settings.college_name (default College of Arts and Sciences) with
a Settings field, merged into the Training Agreement, both In-plant
Agreements, and the Weekly Progress Report — replacing the hardcoded red
college text so other colleges can adopt the system by changing one
setting.
</commit_message>
<xml_diff>
--- a/public/documents/templates/training-agreement-template.docx
+++ b/public/documents/templates/training-agreement-template.docx
@@ -179,13 +179,13 @@
         <w:rPr>
           <w:rFonts w:ascii="Arial" w:hAnsi="Arial"/>
         </w:rPr>
-        <w:t xml:space="preserve">work experience related to the academic training gained from the College of </w:t>
-      </w:r>
-      <w:r>
-        <w:rPr>
-          <w:rFonts w:ascii="Arial" w:hAnsi="Arial"/>
-        </w:rPr>
-        <w:t>Arts and Sciences</w:t>
+        <w:t xml:space="preserve">work experience related to the academic training gained from the ${college_name}</w:t>
+      </w:r>
+      <w:r>
+        <w:rPr>
+          <w:rFonts w:ascii="Arial" w:hAnsi="Arial"/>
+        </w:rPr>
+        <w:t/>
       </w:r>
       <w:r>
         <w:rPr>

</xml_diff>